<commit_message>
Rozdział 5 w 1/3
</commit_message>
<xml_diff>
--- a/_PRACA MAGISTERSKA/praca_magisterska_sgh_v4.docx
+++ b/_PRACA MAGISTERSKA/praca_magisterska_sgh_v4.docx
@@ -4642,45 +4642,25 @@
       <w:r>
         <w:t xml:space="preserve">Rysunek </w:t>
       </w:r>
-      <w:r>
-        <w:fldChar w:fldCharType="begin"/>
-      </w:r>
-      <w:r>
-        <w:instrText xml:space="preserve"> STYLEREF 1 \s </w:instrText>
-      </w:r>
-      <w:r>
-        <w:fldChar w:fldCharType="separate"/>
-      </w:r>
-      <w:r>
-        <w:rPr>
-          <w:noProof/>
-        </w:rPr>
-        <w:t>2</w:t>
-      </w:r>
-      <w:r>
-        <w:fldChar w:fldCharType="end"/>
-      </w:r>
+      <w:fldSimple w:instr=" STYLEREF 1 \s ">
+        <w:r>
+          <w:rPr>
+            <w:noProof/>
+          </w:rPr>
+          <w:t>2</w:t>
+        </w:r>
+      </w:fldSimple>
       <w:r>
         <w:noBreakHyphen/>
       </w:r>
-      <w:r>
-        <w:fldChar w:fldCharType="begin"/>
-      </w:r>
-      <w:r>
-        <w:instrText xml:space="preserve"> SEQ Rysunek \* ARABIC \s 1 </w:instrText>
-      </w:r>
-      <w:r>
-        <w:fldChar w:fldCharType="separate"/>
-      </w:r>
-      <w:r>
-        <w:rPr>
-          <w:noProof/>
-        </w:rPr>
-        <w:t>1</w:t>
-      </w:r>
-      <w:r>
-        <w:fldChar w:fldCharType="end"/>
-      </w:r>
+      <w:fldSimple w:instr=" SEQ Rysunek \* ARABIC \s 1 ">
+        <w:r>
+          <w:rPr>
+            <w:noProof/>
+          </w:rPr>
+          <w:t>1</w:t>
+        </w:r>
+      </w:fldSimple>
       <w:r>
         <w:t xml:space="preserve"> </w:t>
       </w:r>
@@ -6352,45 +6332,25 @@
       <w:r>
         <w:t xml:space="preserve">Tabela </w:t>
       </w:r>
-      <w:r>
-        <w:fldChar w:fldCharType="begin"/>
-      </w:r>
-      <w:r>
-        <w:instrText xml:space="preserve"> STYLEREF 1 \s </w:instrText>
-      </w:r>
-      <w:r>
-        <w:fldChar w:fldCharType="separate"/>
-      </w:r>
-      <w:r>
-        <w:rPr>
-          <w:noProof/>
-        </w:rPr>
-        <w:t>3</w:t>
-      </w:r>
-      <w:r>
-        <w:fldChar w:fldCharType="end"/>
-      </w:r>
+      <w:fldSimple w:instr=" STYLEREF 1 \s ">
+        <w:r>
+          <w:rPr>
+            <w:noProof/>
+          </w:rPr>
+          <w:t>3</w:t>
+        </w:r>
+      </w:fldSimple>
       <w:r>
         <w:noBreakHyphen/>
       </w:r>
-      <w:r>
-        <w:fldChar w:fldCharType="begin"/>
-      </w:r>
-      <w:r>
-        <w:instrText xml:space="preserve"> SEQ Tabela \* ARABIC \s 1 </w:instrText>
-      </w:r>
-      <w:r>
-        <w:fldChar w:fldCharType="separate"/>
-      </w:r>
-      <w:r>
-        <w:rPr>
-          <w:noProof/>
-        </w:rPr>
-        <w:t>1</w:t>
-      </w:r>
-      <w:r>
-        <w:fldChar w:fldCharType="end"/>
-      </w:r>
+      <w:fldSimple w:instr=" SEQ Tabela \* ARABIC \s 1 ">
+        <w:r>
+          <w:rPr>
+            <w:noProof/>
+          </w:rPr>
+          <w:t>1</w:t>
+        </w:r>
+      </w:fldSimple>
       <w:r>
         <w:t xml:space="preserve"> Mapowanie klas pobudzeni zgodnie ze standardem AAMI EC57.</w:t>
       </w:r>
@@ -6478,7 +6438,7 @@
         </w:rPr>
         <w:lastRenderedPageBreak/>
         <w:drawing>
-          <wp:inline distT="0" distB="0" distL="0" distR="0" wp14:anchorId="56229CD0" wp14:editId="118E9420">
+          <wp:inline distT="0" distB="0" distL="0" distR="0" wp14:anchorId="56229CD0" wp14:editId="365EC59A">
             <wp:extent cx="5759450" cy="3422650"/>
             <wp:effectExtent l="0" t="0" r="0" b="6350"/>
             <wp:docPr id="386852549" name="Obraz 10"/>
@@ -6535,45 +6495,25 @@
       <w:r>
         <w:t xml:space="preserve">Rysunek </w:t>
       </w:r>
-      <w:r>
-        <w:fldChar w:fldCharType="begin"/>
-      </w:r>
-      <w:r>
-        <w:instrText xml:space="preserve"> STYLEREF 1 \s </w:instrText>
-      </w:r>
-      <w:r>
-        <w:fldChar w:fldCharType="separate"/>
-      </w:r>
-      <w:r>
-        <w:rPr>
-          <w:noProof/>
-        </w:rPr>
-        <w:t>3</w:t>
-      </w:r>
-      <w:r>
-        <w:fldChar w:fldCharType="end"/>
-      </w:r>
+      <w:fldSimple w:instr=" STYLEREF 1 \s ">
+        <w:r>
+          <w:rPr>
+            <w:noProof/>
+          </w:rPr>
+          <w:t>3</w:t>
+        </w:r>
+      </w:fldSimple>
       <w:r>
         <w:noBreakHyphen/>
       </w:r>
-      <w:r>
-        <w:fldChar w:fldCharType="begin"/>
-      </w:r>
-      <w:r>
-        <w:instrText xml:space="preserve"> SEQ Rysunek \* ARABIC \s 1 </w:instrText>
-      </w:r>
-      <w:r>
-        <w:fldChar w:fldCharType="separate"/>
-      </w:r>
-      <w:r>
-        <w:rPr>
-          <w:noProof/>
-        </w:rPr>
-        <w:t>1</w:t>
-      </w:r>
-      <w:r>
-        <w:fldChar w:fldCharType="end"/>
-      </w:r>
+      <w:fldSimple w:instr=" SEQ Rysunek \* ARABIC \s 1 ">
+        <w:r>
+          <w:rPr>
+            <w:noProof/>
+          </w:rPr>
+          <w:t>1</w:t>
+        </w:r>
+      </w:fldSimple>
       <w:r>
         <w:t xml:space="preserve"> </w:t>
       </w:r>
@@ -7645,45 +7585,25 @@
       <w:r>
         <w:t xml:space="preserve">Tabela </w:t>
       </w:r>
-      <w:r>
-        <w:fldChar w:fldCharType="begin"/>
-      </w:r>
-      <w:r>
-        <w:instrText xml:space="preserve"> STYLEREF 1 \s </w:instrText>
-      </w:r>
-      <w:r>
-        <w:fldChar w:fldCharType="separate"/>
-      </w:r>
-      <w:r>
-        <w:rPr>
-          <w:noProof/>
-        </w:rPr>
-        <w:t>3</w:t>
-      </w:r>
-      <w:r>
-        <w:fldChar w:fldCharType="end"/>
-      </w:r>
+      <w:fldSimple w:instr=" STYLEREF 1 \s ">
+        <w:r>
+          <w:rPr>
+            <w:noProof/>
+          </w:rPr>
+          <w:t>3</w:t>
+        </w:r>
+      </w:fldSimple>
       <w:r>
         <w:noBreakHyphen/>
       </w:r>
-      <w:r>
-        <w:fldChar w:fldCharType="begin"/>
-      </w:r>
-      <w:r>
-        <w:instrText xml:space="preserve"> SEQ Tabela \* ARABIC \s 1 </w:instrText>
-      </w:r>
-      <w:r>
-        <w:fldChar w:fldCharType="separate"/>
-      </w:r>
-      <w:r>
-        <w:rPr>
-          <w:noProof/>
-        </w:rPr>
-        <w:t>2</w:t>
-      </w:r>
-      <w:r>
-        <w:fldChar w:fldCharType="end"/>
-      </w:r>
+      <w:fldSimple w:instr=" SEQ Tabela \* ARABIC \s 1 ">
+        <w:r>
+          <w:rPr>
+            <w:noProof/>
+          </w:rPr>
+          <w:t>2</w:t>
+        </w:r>
+      </w:fldSimple>
       <w:r>
         <w:t xml:space="preserve"> Proporcje pobudzeni w klasach</w:t>
       </w:r>
@@ -8593,45 +8513,25 @@
       <w:r>
         <w:t xml:space="preserve">Tabela </w:t>
       </w:r>
-      <w:r>
-        <w:fldChar w:fldCharType="begin"/>
-      </w:r>
-      <w:r>
-        <w:instrText xml:space="preserve"> STYLEREF 1 \s </w:instrText>
-      </w:r>
-      <w:r>
-        <w:fldChar w:fldCharType="separate"/>
-      </w:r>
-      <w:r>
-        <w:rPr>
-          <w:noProof/>
-        </w:rPr>
-        <w:t>3</w:t>
-      </w:r>
-      <w:r>
-        <w:fldChar w:fldCharType="end"/>
-      </w:r>
+      <w:fldSimple w:instr=" STYLEREF 1 \s ">
+        <w:r>
+          <w:rPr>
+            <w:noProof/>
+          </w:rPr>
+          <w:t>3</w:t>
+        </w:r>
+      </w:fldSimple>
       <w:r>
         <w:noBreakHyphen/>
       </w:r>
-      <w:r>
-        <w:fldChar w:fldCharType="begin"/>
-      </w:r>
-      <w:r>
-        <w:instrText xml:space="preserve"> SEQ Tabela \* ARABIC \s 1 </w:instrText>
-      </w:r>
-      <w:r>
-        <w:fldChar w:fldCharType="separate"/>
-      </w:r>
-      <w:r>
-        <w:rPr>
-          <w:noProof/>
-        </w:rPr>
-        <w:t>3</w:t>
-      </w:r>
-      <w:r>
-        <w:fldChar w:fldCharType="end"/>
-      </w:r>
+      <w:fldSimple w:instr=" SEQ Tabela \* ARABIC \s 1 ">
+        <w:r>
+          <w:rPr>
+            <w:noProof/>
+          </w:rPr>
+          <w:t>3</w:t>
+        </w:r>
+      </w:fldSimple>
       <w:r>
         <w:t xml:space="preserve"> Statystyki amplitudy sygnału w zbiorze danych</w:t>
       </w:r>
@@ -8805,45 +8705,25 @@
       <w:r>
         <w:t xml:space="preserve">Rysunek </w:t>
       </w:r>
-      <w:r>
-        <w:fldChar w:fldCharType="begin"/>
-      </w:r>
-      <w:r>
-        <w:instrText xml:space="preserve"> STYLEREF 1 \s </w:instrText>
-      </w:r>
-      <w:r>
-        <w:fldChar w:fldCharType="separate"/>
-      </w:r>
-      <w:r>
-        <w:rPr>
-          <w:noProof/>
-        </w:rPr>
-        <w:t>3</w:t>
-      </w:r>
-      <w:r>
-        <w:fldChar w:fldCharType="end"/>
-      </w:r>
+      <w:fldSimple w:instr=" STYLEREF 1 \s ">
+        <w:r>
+          <w:rPr>
+            <w:noProof/>
+          </w:rPr>
+          <w:t>3</w:t>
+        </w:r>
+      </w:fldSimple>
       <w:r>
         <w:noBreakHyphen/>
       </w:r>
-      <w:r>
-        <w:fldChar w:fldCharType="begin"/>
-      </w:r>
-      <w:r>
-        <w:instrText xml:space="preserve"> SEQ Rysunek \* ARABIC \s 1 </w:instrText>
-      </w:r>
-      <w:r>
-        <w:fldChar w:fldCharType="separate"/>
-      </w:r>
-      <w:r>
-        <w:rPr>
-          <w:noProof/>
-        </w:rPr>
-        <w:t>2</w:t>
-      </w:r>
-      <w:r>
-        <w:fldChar w:fldCharType="end"/>
-      </w:r>
+      <w:fldSimple w:instr=" SEQ Rysunek \* ARABIC \s 1 ">
+        <w:r>
+          <w:rPr>
+            <w:noProof/>
+          </w:rPr>
+          <w:t>2</w:t>
+        </w:r>
+      </w:fldSimple>
       <w:r>
         <w:t xml:space="preserve"> Rozkład amplitud sygnału EKG</w:t>
       </w:r>
@@ -8929,7 +8809,7 @@
           <w:noProof/>
         </w:rPr>
         <w:drawing>
-          <wp:inline distT="0" distB="0" distL="0" distR="0" wp14:anchorId="549AAE15" wp14:editId="5239C19D">
+          <wp:inline distT="0" distB="0" distL="0" distR="0" wp14:anchorId="549AAE15" wp14:editId="2CDD06E8">
             <wp:extent cx="4233902" cy="3504885"/>
             <wp:effectExtent l="0" t="0" r="0" b="635"/>
             <wp:docPr id="318960103" name="Obraz 3"/>
@@ -8987,45 +8867,25 @@
       <w:r>
         <w:t xml:space="preserve">Rysunek </w:t>
       </w:r>
-      <w:r>
-        <w:fldChar w:fldCharType="begin"/>
-      </w:r>
-      <w:r>
-        <w:instrText xml:space="preserve"> STYLEREF 1 \s </w:instrText>
-      </w:r>
-      <w:r>
-        <w:fldChar w:fldCharType="separate"/>
-      </w:r>
-      <w:r>
-        <w:rPr>
-          <w:noProof/>
-        </w:rPr>
-        <w:t>3</w:t>
-      </w:r>
-      <w:r>
-        <w:fldChar w:fldCharType="end"/>
-      </w:r>
+      <w:fldSimple w:instr=" STYLEREF 1 \s ">
+        <w:r>
+          <w:rPr>
+            <w:noProof/>
+          </w:rPr>
+          <w:t>3</w:t>
+        </w:r>
+      </w:fldSimple>
       <w:r>
         <w:noBreakHyphen/>
       </w:r>
-      <w:r>
-        <w:fldChar w:fldCharType="begin"/>
-      </w:r>
-      <w:r>
-        <w:instrText xml:space="preserve"> SEQ Rysunek \* ARABIC \s 1 </w:instrText>
-      </w:r>
-      <w:r>
-        <w:fldChar w:fldCharType="separate"/>
-      </w:r>
-      <w:r>
-        <w:rPr>
-          <w:noProof/>
-        </w:rPr>
-        <w:t>3</w:t>
-      </w:r>
-      <w:r>
-        <w:fldChar w:fldCharType="end"/>
-      </w:r>
+      <w:fldSimple w:instr=" SEQ Rysunek \* ARABIC \s 1 ">
+        <w:r>
+          <w:rPr>
+            <w:noProof/>
+          </w:rPr>
+          <w:t>3</w:t>
+        </w:r>
+      </w:fldSimple>
       <w:r>
         <w:t xml:space="preserve"> Przykładowe przebiegi QRS dla klas.</w:t>
       </w:r>
@@ -9099,45 +8959,25 @@
       <w:r>
         <w:t xml:space="preserve">Rysunek </w:t>
       </w:r>
-      <w:r>
-        <w:fldChar w:fldCharType="begin"/>
-      </w:r>
-      <w:r>
-        <w:instrText xml:space="preserve"> STYLEREF 1 \s </w:instrText>
-      </w:r>
-      <w:r>
-        <w:fldChar w:fldCharType="separate"/>
-      </w:r>
-      <w:r>
-        <w:rPr>
-          <w:noProof/>
-        </w:rPr>
-        <w:t>3</w:t>
-      </w:r>
-      <w:r>
-        <w:fldChar w:fldCharType="end"/>
-      </w:r>
+      <w:fldSimple w:instr=" STYLEREF 1 \s ">
+        <w:r>
+          <w:rPr>
+            <w:noProof/>
+          </w:rPr>
+          <w:t>3</w:t>
+        </w:r>
+      </w:fldSimple>
       <w:r>
         <w:noBreakHyphen/>
       </w:r>
-      <w:r>
-        <w:fldChar w:fldCharType="begin"/>
-      </w:r>
-      <w:r>
-        <w:instrText xml:space="preserve"> SEQ Rysunek \* ARABIC \s 1 </w:instrText>
-      </w:r>
-      <w:r>
-        <w:fldChar w:fldCharType="separate"/>
-      </w:r>
-      <w:r>
-        <w:rPr>
-          <w:noProof/>
-        </w:rPr>
-        <w:t>4</w:t>
-      </w:r>
-      <w:r>
-        <w:fldChar w:fldCharType="end"/>
-      </w:r>
+      <w:fldSimple w:instr=" SEQ Rysunek \* ARABIC \s 1 ">
+        <w:r>
+          <w:rPr>
+            <w:noProof/>
+          </w:rPr>
+          <w:t>4</w:t>
+        </w:r>
+      </w:fldSimple>
       <w:r>
         <w:t xml:space="preserve"> Uśredniony przebieg QRS</w:t>
       </w:r>
@@ -10879,45 +10719,25 @@
       <w:r>
         <w:t xml:space="preserve">Rysunek </w:t>
       </w:r>
-      <w:r>
-        <w:fldChar w:fldCharType="begin"/>
-      </w:r>
-      <w:r>
-        <w:instrText xml:space="preserve"> STYLEREF 1 \s </w:instrText>
-      </w:r>
-      <w:r>
-        <w:fldChar w:fldCharType="separate"/>
-      </w:r>
-      <w:r>
-        <w:rPr>
-          <w:noProof/>
-        </w:rPr>
-        <w:t>4</w:t>
-      </w:r>
-      <w:r>
-        <w:fldChar w:fldCharType="end"/>
-      </w:r>
+      <w:fldSimple w:instr=" STYLEREF 1 \s ">
+        <w:r>
+          <w:rPr>
+            <w:noProof/>
+          </w:rPr>
+          <w:t>4</w:t>
+        </w:r>
+      </w:fldSimple>
       <w:r>
         <w:noBreakHyphen/>
       </w:r>
-      <w:r>
-        <w:fldChar w:fldCharType="begin"/>
-      </w:r>
-      <w:r>
-        <w:instrText xml:space="preserve"> SEQ Rysunek \* ARABIC \s 1 </w:instrText>
-      </w:r>
-      <w:r>
-        <w:fldChar w:fldCharType="separate"/>
-      </w:r>
-      <w:r>
-        <w:rPr>
-          <w:noProof/>
-        </w:rPr>
-        <w:t>1</w:t>
-      </w:r>
-      <w:r>
-        <w:fldChar w:fldCharType="end"/>
-      </w:r>
+      <w:fldSimple w:instr=" SEQ Rysunek \* ARABIC \s 1 ">
+        <w:r>
+          <w:rPr>
+            <w:noProof/>
+          </w:rPr>
+          <w:t>1</w:t>
+        </w:r>
+      </w:fldSimple>
       <w:r>
         <w:t xml:space="preserve"> Schemat potoku przetwarzania.</w:t>
       </w:r>
@@ -11751,15 +11571,7 @@
           <w:sz w:val="24"/>
           <w:szCs w:val="24"/>
         </w:rPr>
-        <w:t>Zamiast ciągłej inferencji dla każdej napływającej próbki (co byłoby nieefektywne i generowałoby nadmiarowe wyniki), system wykorzystuje strategię wyzwalania zdarzeniami (event-driven analysis). Proces ten realizowany jest w trzech etapach:</w:t>
-      </w:r>
-      <w:r>
-        <w:rPr>
-          <w:rFonts w:ascii="Times New Roman" w:hAnsi="Times New Roman" w:cs="Times New Roman"/>
-          <w:sz w:val="24"/>
-          <w:szCs w:val="24"/>
-        </w:rPr>
-        <w:t xml:space="preserve"> </w:t>
+        <w:t xml:space="preserve">Zamiast ciągłej inferencji dla każdej napływającej próbki (co byłoby nieefektywne i generowałoby nadmiarowe wyniki), system wykorzystuje strategię wyzwalania zdarzeniami (event-driven analysis). Proces ten realizowany jest w trzech etapach: </w:t>
       </w:r>
     </w:p>
     <w:p>
@@ -12806,45 +12618,25 @@
       <w:r>
         <w:t xml:space="preserve">Rysunek </w:t>
       </w:r>
-      <w:r>
-        <w:fldChar w:fldCharType="begin"/>
-      </w:r>
-      <w:r>
-        <w:instrText xml:space="preserve"> STYLEREF 1 \s </w:instrText>
-      </w:r>
-      <w:r>
-        <w:fldChar w:fldCharType="separate"/>
-      </w:r>
-      <w:r>
-        <w:rPr>
-          <w:noProof/>
-        </w:rPr>
-        <w:t>4</w:t>
-      </w:r>
-      <w:r>
-        <w:fldChar w:fldCharType="end"/>
-      </w:r>
+      <w:fldSimple w:instr=" STYLEREF 1 \s ">
+        <w:r>
+          <w:rPr>
+            <w:noProof/>
+          </w:rPr>
+          <w:t>4</w:t>
+        </w:r>
+      </w:fldSimple>
       <w:r>
         <w:noBreakHyphen/>
       </w:r>
-      <w:r>
-        <w:fldChar w:fldCharType="begin"/>
-      </w:r>
-      <w:r>
-        <w:instrText xml:space="preserve"> SEQ Rysunek \* ARABIC \s 1 </w:instrText>
-      </w:r>
-      <w:r>
-        <w:fldChar w:fldCharType="separate"/>
-      </w:r>
-      <w:r>
-        <w:rPr>
-          <w:noProof/>
-        </w:rPr>
-        <w:t>2</w:t>
-      </w:r>
-      <w:r>
-        <w:fldChar w:fldCharType="end"/>
-      </w:r>
+      <w:fldSimple w:instr=" SEQ Rysunek \* ARABIC \s 1 ">
+        <w:r>
+          <w:rPr>
+            <w:noProof/>
+          </w:rPr>
+          <w:t>2</w:t>
+        </w:r>
+      </w:fldSimple>
       <w:r>
         <w:t xml:space="preserve"> Etapy algorytmu Pan-Tomkins na przykładzie rekordu 101.</w:t>
       </w:r>
@@ -13680,13 +13472,7 @@
         <w:rPr>
           <w:rFonts w:ascii="Cambria Math" w:hAnsi="Cambria Math"/>
         </w:rPr>
-        <w:t>o wypełnieniu bufora nowe próbki automatycznie wypychają najstarsze z przeciwnego końca, co zapewnia O(1) dla operacji append</w:t>
-      </w:r>
-      <w:r>
-        <w:rPr>
-          <w:rFonts w:ascii="Cambria Math" w:hAnsi="Cambria Math"/>
-        </w:rPr>
-        <w:t>.</w:t>
+        <w:t>o wypełnieniu bufora nowe próbki automatycznie wypychają najstarsze z przeciwnego końca, co zapewnia O(1) dla operacji append.</w:t>
       </w:r>
     </w:p>
     <w:p>
@@ -13711,7 +13497,13 @@
           <w:sz w:val="24"/>
           <w:szCs w:val="24"/>
         </w:rPr>
-        <w:t>plot_buffer</w:t>
+        <w:t>plot_buffer,</w:t>
+      </w:r>
+      <w:r>
+        <w:rPr>
+          <w:rFonts w:ascii="Cambria Math" w:hAnsi="Cambria Math"/>
+        </w:rPr>
+        <w:t xml:space="preserve"> który odpowiada za płynność wyświetlania sygnału EKG, podczas gdy większy bufor </w:t>
       </w:r>
       <w:r>
         <w:rPr>
@@ -13720,58 +13512,13 @@
           <w:sz w:val="24"/>
           <w:szCs w:val="24"/>
         </w:rPr>
-        <w:t>,</w:t>
+        <w:t>pt_buf</w:t>
       </w:r>
       <w:r>
         <w:rPr>
           <w:rFonts w:ascii="Cambria Math" w:hAnsi="Cambria Math"/>
         </w:rPr>
-        <w:t xml:space="preserve"> </w:t>
-      </w:r>
-      <w:r>
-        <w:rPr>
-          <w:rFonts w:ascii="Cambria Math" w:hAnsi="Cambria Math"/>
-        </w:rPr>
-        <w:t xml:space="preserve">który </w:t>
-      </w:r>
-      <w:r>
-        <w:rPr>
-          <w:rFonts w:ascii="Cambria Math" w:hAnsi="Cambria Math"/>
-        </w:rPr>
-        <w:t xml:space="preserve">odpowiada za płynność wyświetlania </w:t>
-      </w:r>
-      <w:r>
-        <w:rPr>
-          <w:rFonts w:ascii="Cambria Math" w:hAnsi="Cambria Math"/>
-        </w:rPr>
-        <w:t>sygnału</w:t>
-      </w:r>
-      <w:r>
-        <w:rPr>
-          <w:rFonts w:ascii="Cambria Math" w:hAnsi="Cambria Math"/>
-        </w:rPr>
-        <w:t xml:space="preserve"> EKG, podczas gdy większy bufor </w:t>
-      </w:r>
-      <w:r>
-        <w:rPr>
-          <w:rStyle w:val="HTML-kod"/>
-          <w:rFonts w:ascii="Cambria Math" w:hAnsi="Cambria Math"/>
-          <w:sz w:val="24"/>
-          <w:szCs w:val="24"/>
-        </w:rPr>
-        <w:t>pt_buf</w:t>
-      </w:r>
-      <w:r>
-        <w:rPr>
-          <w:rFonts w:ascii="Cambria Math" w:hAnsi="Cambria Math"/>
-        </w:rPr>
-        <w:t xml:space="preserve"> dostarcza kontekst niezbędny dla algorytmu Pan-Tompkinsa oraz modelu </w:t>
-      </w:r>
-      <w:r>
-        <w:rPr>
-          <w:rFonts w:ascii="Cambria Math" w:hAnsi="Cambria Math"/>
-        </w:rPr>
-        <w:t>ML.</w:t>
+        <w:t xml:space="preserve"> dostarcza kontekst niezbędny dla algorytmu Pan-Tompkinsa oraz modelu ML.</w:t>
       </w:r>
       <w:r>
         <w:rPr>
@@ -14087,7 +13834,6 @@
       <w:r>
         <w:rPr>
           <w:rFonts w:ascii="Cambria Math" w:hAnsi="Cambria Math"/>
-          <w:lang w:val="en-US"/>
         </w:rPr>
         <w:t xml:space="preserve">  </w:t>
       </w:r>
@@ -14098,25 +13844,7 @@
           <w:szCs w:val="18"/>
           <w:lang w:val="en-US"/>
         </w:rPr>
-        <w:t>line.set_xdata(np.arange(len(</w:t>
-      </w:r>
-      <w:r>
-        <w:rPr>
-          <w:rFonts w:ascii="Consolas" w:hAnsi="Consolas"/>
-          <w:sz w:val="18"/>
-          <w:szCs w:val="18"/>
-          <w:lang w:val="en-US"/>
-        </w:rPr>
-        <w:t>plot buffer</w:t>
-      </w:r>
-      <w:r>
-        <w:rPr>
-          <w:rFonts w:ascii="Consolas" w:hAnsi="Consolas"/>
-          <w:sz w:val="18"/>
-          <w:szCs w:val="18"/>
-          <w:lang w:val="en-US"/>
-        </w:rPr>
-        <w:t>)))</w:t>
+        <w:t>line.set_xdata(np.arange(len(plot buffer)))</w:t>
       </w:r>
     </w:p>
     <w:p>
@@ -14571,46 +14299,26 @@
       <w:r>
         <w:t xml:space="preserve">Tabela </w:t>
       </w:r>
-      <w:r>
-        <w:fldChar w:fldCharType="begin"/>
-      </w:r>
-      <w:r>
-        <w:instrText xml:space="preserve"> STYLEREF 1 \s </w:instrText>
-      </w:r>
-      <w:r>
-        <w:fldChar w:fldCharType="separate"/>
-      </w:r>
-      <w:r>
-        <w:rPr>
-          <w:noProof/>
-        </w:rPr>
-        <w:t>4</w:t>
-      </w:r>
-      <w:r>
-        <w:fldChar w:fldCharType="end"/>
-      </w:r>
+      <w:fldSimple w:instr=" STYLEREF 1 \s ">
+        <w:r>
+          <w:rPr>
+            <w:noProof/>
+          </w:rPr>
+          <w:t>4</w:t>
+        </w:r>
+      </w:fldSimple>
       <w:r>
         <w:noBreakHyphen/>
       </w:r>
-      <w:r>
-        <w:fldChar w:fldCharType="begin"/>
-      </w:r>
-      <w:r>
-        <w:instrText xml:space="preserve"> SEQ Tabela \* ARABIC \s 1 </w:instrText>
-      </w:r>
-      <w:r>
-        <w:fldChar w:fldCharType="separate"/>
-      </w:r>
-      <w:r>
-        <w:rPr>
-          <w:noProof/>
-        </w:rPr>
-        <w:t>1</w:t>
-      </w:r>
-      <w:bookmarkEnd w:id="33"/>
-      <w:r>
-        <w:fldChar w:fldCharType="end"/>
-      </w:r>
+      <w:fldSimple w:instr=" SEQ Tabela \* ARABIC \s 1 ">
+        <w:r>
+          <w:rPr>
+            <w:noProof/>
+          </w:rPr>
+          <w:t>1</w:t>
+        </w:r>
+        <w:bookmarkEnd w:id="33"/>
+      </w:fldSimple>
     </w:p>
     <w:p>
       <w:pPr>
@@ -14976,7 +14684,6 @@
       <w:r>
         <w:rPr>
           <w:rFonts w:ascii="Cambria Math" w:hAnsi="Cambria Math"/>
-          <w:lang w:val="en-US"/>
         </w:rPr>
         <w:t xml:space="preserve"> </w:t>
       </w:r>
@@ -15141,7 +14848,6 @@
         <w:jc w:val="both"/>
         <w:rPr>
           <w:rFonts w:ascii="Cambria Math" w:hAnsi="Cambria Math"/>
-          <w:lang w:val="en-US"/>
         </w:rPr>
       </w:pPr>
       <w:r>
@@ -15205,46 +14911,26 @@
       <w:r>
         <w:t xml:space="preserve">Rysunek </w:t>
       </w:r>
-      <w:r>
-        <w:fldChar w:fldCharType="begin"/>
-      </w:r>
-      <w:r>
-        <w:instrText xml:space="preserve"> STYLEREF 1 \s </w:instrText>
-      </w:r>
-      <w:r>
-        <w:fldChar w:fldCharType="separate"/>
-      </w:r>
-      <w:r>
-        <w:rPr>
-          <w:noProof/>
-        </w:rPr>
-        <w:t>4</w:t>
-      </w:r>
-      <w:r>
-        <w:fldChar w:fldCharType="end"/>
-      </w:r>
+      <w:fldSimple w:instr=" STYLEREF 1 \s ">
+        <w:r>
+          <w:rPr>
+            <w:noProof/>
+          </w:rPr>
+          <w:t>4</w:t>
+        </w:r>
+      </w:fldSimple>
       <w:r>
         <w:noBreakHyphen/>
       </w:r>
-      <w:r>
-        <w:fldChar w:fldCharType="begin"/>
-      </w:r>
-      <w:r>
-        <w:instrText xml:space="preserve"> SEQ Rysunek \* ARABIC \s 1 </w:instrText>
-      </w:r>
-      <w:r>
-        <w:fldChar w:fldCharType="separate"/>
-      </w:r>
-      <w:r>
-        <w:rPr>
-          <w:noProof/>
-        </w:rPr>
-        <w:t>3</w:t>
-      </w:r>
-      <w:bookmarkEnd w:id="34"/>
-      <w:r>
-        <w:fldChar w:fldCharType="end"/>
-      </w:r>
+      <w:fldSimple w:instr=" SEQ Rysunek \* ARABIC \s 1 ">
+        <w:r>
+          <w:rPr>
+            <w:noProof/>
+          </w:rPr>
+          <w:t>3</w:t>
+        </w:r>
+        <w:bookmarkEnd w:id="34"/>
+      </w:fldSimple>
       <w:r>
         <w:t xml:space="preserve"> Wizualizacja programu </w:t>
       </w:r>
@@ -15638,23 +15324,7 @@
           <w:sz w:val="24"/>
           <w:szCs w:val="24"/>
         </w:rPr>
-        <w:t>.</w:t>
-      </w:r>
-      <w:r>
-        <w:rPr>
-          <w:rFonts w:ascii="Times New Roman" w:hAnsi="Times New Roman" w:cs="Times New Roman"/>
-          <w:sz w:val="24"/>
-          <w:szCs w:val="24"/>
-        </w:rPr>
-        <w:t xml:space="preserve"> </w:t>
-      </w:r>
-      <w:r>
-        <w:rPr>
-          <w:rFonts w:ascii="Times New Roman" w:hAnsi="Times New Roman" w:cs="Times New Roman"/>
-          <w:sz w:val="24"/>
-          <w:szCs w:val="24"/>
-        </w:rPr>
-        <w:t>Gradient przepływa przez sieć zarówno ścieżką główną, jak i bezpośrednio przez shortcut, co stabilizuje uczenie i pozwala budować sieci o większej głębokości bez degradacji skuteczności</w:t>
+        <w:t>. Gradient przepływa przez sieć zarówno ścieżką główną, jak i bezpośrednio przez shortcut, co stabilizuje uczenie i pozwala budować sieci o większej głębokości bez degradacji skuteczności</w:t>
       </w:r>
       <w:r>
         <w:rPr>
@@ -16032,15 +15702,7 @@
           <w:sz w:val="24"/>
           <w:szCs w:val="24"/>
         </w:rPr>
-        <w:t>D</w:t>
-      </w:r>
-      <w:r>
-        <w:rPr>
-          <w:rFonts w:ascii="Times New Roman" w:hAnsi="Times New Roman" w:cs="Times New Roman"/>
-          <w:sz w:val="24"/>
-          <w:szCs w:val="24"/>
-        </w:rPr>
-        <w:t>ylatacja (Dilated Convolutions): W blokach 3 i 4 zastosowano dylatację (dilation_rate=2), co pozwala modelowi na naukę szerszego kontekstu czasowego (np. zależności między załamkiem P a T) bez drastycznego zwiększania liczby parametrów.</w:t>
+        <w:t>Dylatacja (Dilated Convolutions): W blokach 3 i 4 zastosowano dylatację (dilation_rate=2), co pozwala modelowi na naukę szerszego kontekstu czasowego (np. zależności między załamkiem P a T) bez drastycznego zwiększania liczby parametrów.</w:t>
       </w:r>
       <w:r>
         <w:rPr>
@@ -16874,7 +16536,7 @@
           <w:noProof/>
         </w:rPr>
         <w:drawing>
-          <wp:inline distT="0" distB="0" distL="0" distR="0" wp14:anchorId="2BD7B4C9" wp14:editId="27119975">
+          <wp:inline distT="0" distB="0" distL="0" distR="0" wp14:anchorId="2BD7B4C9" wp14:editId="67AE82CE">
             <wp:extent cx="3342554" cy="2865046"/>
             <wp:effectExtent l="0" t="0" r="0" b="0"/>
             <wp:docPr id="819872529" name="Obraz 1"/>
@@ -17220,7 +16882,235 @@
         </w:rPr>
       </w:pPr>
     </w:p>
-    <w:p/>
+    <w:p>
+      <w:pPr>
+        <w:spacing w:after="0" w:line="240" w:lineRule="auto"/>
+        <w:rPr>
+          <w:rFonts w:ascii="Times New Roman" w:eastAsia="Times New Roman" w:hAnsi="Times New Roman" w:cs="Times New Roman"/>
+          <w:kern w:val="0"/>
+          <w:lang w:eastAsia="pl-PL"/>
+          <w14:ligatures w14:val="none"/>
+        </w:rPr>
+      </w:pPr>
+      <w:r>
+        <w:rPr>
+          <w:rFonts w:ascii="Times New Roman" w:eastAsia="Times New Roman" w:hAnsi="Times New Roman" w:cs="Times New Roman"/>
+          <w:kern w:val="0"/>
+          <w:lang w:eastAsia="pl-PL"/>
+          <w14:ligatures w14:val="none"/>
+        </w:rPr>
+        <w:t>=== Test set results (BiLSTM) ===</w:t>
+      </w:r>
+    </w:p>
+    <w:p>
+      <w:pPr>
+        <w:spacing w:after="0" w:line="240" w:lineRule="auto"/>
+        <w:rPr>
+          <w:rFonts w:ascii="Times New Roman" w:eastAsia="Times New Roman" w:hAnsi="Times New Roman" w:cs="Times New Roman"/>
+          <w:kern w:val="0"/>
+          <w:lang w:eastAsia="pl-PL"/>
+          <w14:ligatures w14:val="none"/>
+        </w:rPr>
+      </w:pPr>
+      <w:r>
+        <w:rPr>
+          <w:rFonts w:ascii="Times New Roman" w:eastAsia="Times New Roman" w:hAnsi="Times New Roman" w:cs="Times New Roman"/>
+          <w:kern w:val="0"/>
+          <w:lang w:eastAsia="pl-PL"/>
+          <w14:ligatures w14:val="none"/>
+        </w:rPr>
+        <w:t xml:space="preserve">              precision    recall  f1-score   support</w:t>
+      </w:r>
+    </w:p>
+    <w:p>
+      <w:pPr>
+        <w:spacing w:after="0" w:line="240" w:lineRule="auto"/>
+        <w:rPr>
+          <w:rFonts w:ascii="Times New Roman" w:eastAsia="Times New Roman" w:hAnsi="Times New Roman" w:cs="Times New Roman"/>
+          <w:kern w:val="0"/>
+          <w:lang w:eastAsia="pl-PL"/>
+          <w14:ligatures w14:val="none"/>
+        </w:rPr>
+      </w:pPr>
+    </w:p>
+    <w:p>
+      <w:pPr>
+        <w:spacing w:after="0" w:line="240" w:lineRule="auto"/>
+        <w:rPr>
+          <w:rFonts w:ascii="Times New Roman" w:eastAsia="Times New Roman" w:hAnsi="Times New Roman" w:cs="Times New Roman"/>
+          <w:kern w:val="0"/>
+          <w:lang w:eastAsia="pl-PL"/>
+          <w14:ligatures w14:val="none"/>
+        </w:rPr>
+      </w:pPr>
+      <w:r>
+        <w:rPr>
+          <w:rFonts w:ascii="Times New Roman" w:eastAsia="Times New Roman" w:hAnsi="Times New Roman" w:cs="Times New Roman"/>
+          <w:kern w:val="0"/>
+          <w:lang w:eastAsia="pl-PL"/>
+          <w14:ligatures w14:val="none"/>
+        </w:rPr>
+        <w:t xml:space="preserve">           F     0.0159    0.1389    0.0286       360</w:t>
+      </w:r>
+    </w:p>
+    <w:p>
+      <w:pPr>
+        <w:spacing w:after="0" w:line="240" w:lineRule="auto"/>
+        <w:rPr>
+          <w:rFonts w:ascii="Times New Roman" w:eastAsia="Times New Roman" w:hAnsi="Times New Roman" w:cs="Times New Roman"/>
+          <w:kern w:val="0"/>
+          <w:lang w:eastAsia="pl-PL"/>
+          <w14:ligatures w14:val="none"/>
+        </w:rPr>
+      </w:pPr>
+      <w:r>
+        <w:rPr>
+          <w:rFonts w:ascii="Times New Roman" w:eastAsia="Times New Roman" w:hAnsi="Times New Roman" w:cs="Times New Roman"/>
+          <w:kern w:val="0"/>
+          <w:lang w:eastAsia="pl-PL"/>
+          <w14:ligatures w14:val="none"/>
+        </w:rPr>
+        <w:t xml:space="preserve">           N     0.9676    0.6191    0.7551     40328</w:t>
+      </w:r>
+    </w:p>
+    <w:p>
+      <w:pPr>
+        <w:spacing w:after="0" w:line="240" w:lineRule="auto"/>
+        <w:rPr>
+          <w:rFonts w:ascii="Times New Roman" w:eastAsia="Times New Roman" w:hAnsi="Times New Roman" w:cs="Times New Roman"/>
+          <w:kern w:val="0"/>
+          <w:lang w:eastAsia="pl-PL"/>
+          <w14:ligatures w14:val="none"/>
+        </w:rPr>
+      </w:pPr>
+      <w:r>
+        <w:rPr>
+          <w:rFonts w:ascii="Times New Roman" w:eastAsia="Times New Roman" w:hAnsi="Times New Roman" w:cs="Times New Roman"/>
+          <w:kern w:val="0"/>
+          <w:lang w:eastAsia="pl-PL"/>
+          <w14:ligatures w14:val="none"/>
+        </w:rPr>
+        <w:t xml:space="preserve">           Q     0.0129    0.2727    0.0246       484</w:t>
+      </w:r>
+    </w:p>
+    <w:p>
+      <w:pPr>
+        <w:spacing w:after="0" w:line="240" w:lineRule="auto"/>
+        <w:rPr>
+          <w:rFonts w:ascii="Times New Roman" w:eastAsia="Times New Roman" w:hAnsi="Times New Roman" w:cs="Times New Roman"/>
+          <w:kern w:val="0"/>
+          <w:lang w:eastAsia="pl-PL"/>
+          <w14:ligatures w14:val="none"/>
+        </w:rPr>
+      </w:pPr>
+      <w:r>
+        <w:rPr>
+          <w:rFonts w:ascii="Times New Roman" w:eastAsia="Times New Roman" w:hAnsi="Times New Roman" w:cs="Times New Roman"/>
+          <w:kern w:val="0"/>
+          <w:lang w:eastAsia="pl-PL"/>
+          <w14:ligatures w14:val="none"/>
+        </w:rPr>
+        <w:t xml:space="preserve">           S     0.0364    0.0465    0.0409      1591</w:t>
+      </w:r>
+    </w:p>
+    <w:p>
+      <w:pPr>
+        <w:spacing w:after="0" w:line="240" w:lineRule="auto"/>
+        <w:rPr>
+          <w:rFonts w:ascii="Times New Roman" w:eastAsia="Times New Roman" w:hAnsi="Times New Roman" w:cs="Times New Roman"/>
+          <w:kern w:val="0"/>
+          <w:lang w:eastAsia="pl-PL"/>
+          <w14:ligatures w14:val="none"/>
+        </w:rPr>
+      </w:pPr>
+      <w:r>
+        <w:rPr>
+          <w:rFonts w:ascii="Times New Roman" w:eastAsia="Times New Roman" w:hAnsi="Times New Roman" w:cs="Times New Roman"/>
+          <w:kern w:val="0"/>
+          <w:lang w:eastAsia="pl-PL"/>
+          <w14:ligatures w14:val="none"/>
+        </w:rPr>
+        <w:t xml:space="preserve">           V     0.4223    0.8812    0.5710      1422</w:t>
+      </w:r>
+    </w:p>
+    <w:p>
+      <w:pPr>
+        <w:spacing w:after="0" w:line="240" w:lineRule="auto"/>
+        <w:rPr>
+          <w:rFonts w:ascii="Times New Roman" w:eastAsia="Times New Roman" w:hAnsi="Times New Roman" w:cs="Times New Roman"/>
+          <w:kern w:val="0"/>
+          <w:lang w:eastAsia="pl-PL"/>
+          <w14:ligatures w14:val="none"/>
+        </w:rPr>
+      </w:pPr>
+    </w:p>
+    <w:p>
+      <w:pPr>
+        <w:spacing w:after="0" w:line="240" w:lineRule="auto"/>
+        <w:rPr>
+          <w:rFonts w:ascii="Times New Roman" w:eastAsia="Times New Roman" w:hAnsi="Times New Roman" w:cs="Times New Roman"/>
+          <w:kern w:val="0"/>
+          <w:lang w:val="en-US" w:eastAsia="pl-PL"/>
+          <w14:ligatures w14:val="none"/>
+        </w:rPr>
+      </w:pPr>
+      <w:r>
+        <w:rPr>
+          <w:rFonts w:ascii="Times New Roman" w:eastAsia="Times New Roman" w:hAnsi="Times New Roman" w:cs="Times New Roman"/>
+          <w:kern w:val="0"/>
+          <w:lang w:val="en-US" w:eastAsia="pl-PL"/>
+          <w14:ligatures w14:val="none"/>
+        </w:rPr>
+        <w:t xml:space="preserve">    accuracy                         0.5992     44185</w:t>
+      </w:r>
+    </w:p>
+    <w:p>
+      <w:pPr>
+        <w:spacing w:after="0" w:line="240" w:lineRule="auto"/>
+        <w:rPr>
+          <w:rFonts w:ascii="Times New Roman" w:eastAsia="Times New Roman" w:hAnsi="Times New Roman" w:cs="Times New Roman"/>
+          <w:kern w:val="0"/>
+          <w:lang w:val="en-US" w:eastAsia="pl-PL"/>
+          <w14:ligatures w14:val="none"/>
+        </w:rPr>
+      </w:pPr>
+      <w:r>
+        <w:rPr>
+          <w:rFonts w:ascii="Times New Roman" w:eastAsia="Times New Roman" w:hAnsi="Times New Roman" w:cs="Times New Roman"/>
+          <w:kern w:val="0"/>
+          <w:lang w:val="en-US" w:eastAsia="pl-PL"/>
+          <w14:ligatures w14:val="none"/>
+        </w:rPr>
+        <w:t xml:space="preserve">   macro avg     0.2910    0.3917    0.2840     44185</w:t>
+      </w:r>
+    </w:p>
+    <w:p>
+      <w:pPr>
+        <w:spacing w:after="0" w:line="240" w:lineRule="auto"/>
+        <w:rPr>
+          <w:rFonts w:ascii="Times New Roman" w:eastAsia="Times New Roman" w:hAnsi="Times New Roman" w:cs="Times New Roman"/>
+          <w:kern w:val="0"/>
+          <w:lang w:val="en-US" w:eastAsia="pl-PL"/>
+          <w14:ligatures w14:val="none"/>
+        </w:rPr>
+      </w:pPr>
+      <w:r>
+        <w:rPr>
+          <w:rFonts w:ascii="Times New Roman" w:eastAsia="Times New Roman" w:hAnsi="Times New Roman" w:cs="Times New Roman"/>
+          <w:kern w:val="0"/>
+          <w:lang w:val="en-US" w:eastAsia="pl-PL"/>
+          <w14:ligatures w14:val="none"/>
+        </w:rPr>
+        <w:t>weighted avg     0.8983    0.5992    0.7095     44185</w:t>
+      </w:r>
+    </w:p>
+    <w:p>
+      <w:pPr>
+        <w:rPr>
+          <w:lang w:val="en-US"/>
+        </w:rPr>
+      </w:pPr>
+    </w:p>
     <w:p>
       <w:pPr>
         <w:jc w:val="both"/>
@@ -17228,6 +17118,7 @@
           <w:rFonts w:ascii="Times New Roman" w:hAnsi="Times New Roman" w:cs="Times New Roman"/>
           <w:b/>
           <w:bCs/>
+          <w:lang w:val="en-US"/>
         </w:rPr>
       </w:pPr>
     </w:p>
@@ -17240,9 +17131,128 @@
           <w:color w:val="000000" w:themeColor="text1"/>
           <w:sz w:val="28"/>
           <w:szCs w:val="36"/>
-        </w:rPr>
-      </w:pPr>
-      <w:r>
+          <w:lang w:val="en-US"/>
+        </w:rPr>
+      </w:pPr>
+      <w:r>
+        <w:rPr>
+          <w:rFonts w:ascii="Times New Roman" w:eastAsia="Times New Roman" w:hAnsi="Times New Roman" w:cs="Times New Roman"/>
+          <w:noProof/>
+          <w:kern w:val="0"/>
+          <w:lang w:val="en-US" w:eastAsia="pl-PL"/>
+          <w14:ligatures w14:val="none"/>
+        </w:rPr>
+        <w:lastRenderedPageBreak/>
+        <w:drawing>
+          <wp:inline distT="0" distB="0" distL="0" distR="0" wp14:anchorId="638F4328" wp14:editId="0A104A93">
+            <wp:extent cx="5570855" cy="4779645"/>
+            <wp:effectExtent l="0" t="0" r="0" b="1905"/>
+            <wp:docPr id="855297548" name="Obraz 1"/>
+            <wp:cNvGraphicFramePr>
+              <a:graphicFrameLocks xmlns:a="http://schemas.openxmlformats.org/drawingml/2006/main" noChangeAspect="1"/>
+            </wp:cNvGraphicFramePr>
+            <a:graphic xmlns:a="http://schemas.openxmlformats.org/drawingml/2006/main">
+              <a:graphicData uri="http://schemas.openxmlformats.org/drawingml/2006/picture">
+                <pic:pic xmlns:pic="http://schemas.openxmlformats.org/drawingml/2006/picture">
+                  <pic:nvPicPr>
+                    <pic:cNvPr id="0" name="Picture 1"/>
+                    <pic:cNvPicPr>
+                      <a:picLocks noChangeAspect="1" noChangeArrowheads="1"/>
+                    </pic:cNvPicPr>
+                  </pic:nvPicPr>
+                  <pic:blipFill>
+                    <a:blip r:embed="rId23">
+                      <a:extLst>
+                        <a:ext uri="{28A0092B-C50C-407E-A947-70E740481C1C}">
+                          <a14:useLocalDpi xmlns:a14="http://schemas.microsoft.com/office/drawing/2010/main" val="0"/>
+                        </a:ext>
+                      </a:extLst>
+                    </a:blip>
+                    <a:srcRect/>
+                    <a:stretch>
+                      <a:fillRect/>
+                    </a:stretch>
+                  </pic:blipFill>
+                  <pic:spPr bwMode="auto">
+                    <a:xfrm>
+                      <a:off x="0" y="0"/>
+                      <a:ext cx="5570855" cy="4779645"/>
+                    </a:xfrm>
+                    <a:prstGeom prst="rect">
+                      <a:avLst/>
+                    </a:prstGeom>
+                    <a:noFill/>
+                    <a:ln>
+                      <a:noFill/>
+                    </a:ln>
+                  </pic:spPr>
+                </pic:pic>
+              </a:graphicData>
+            </a:graphic>
+          </wp:inline>
+        </w:drawing>
+      </w:r>
+      <w:r>
+        <w:rPr>
+          <w:rFonts w:ascii="Times New Roman" w:eastAsia="Times New Roman" w:hAnsi="Times New Roman" w:cs="Times New Roman"/>
+          <w:noProof/>
+          <w:kern w:val="0"/>
+          <w:lang w:val="en-US" w:eastAsia="pl-PL"/>
+          <w14:ligatures w14:val="none"/>
+        </w:rPr>
+        <w:drawing>
+          <wp:inline distT="0" distB="0" distL="0" distR="0" wp14:anchorId="2E09923D" wp14:editId="0AC2A131">
+            <wp:extent cx="5570855" cy="1859280"/>
+            <wp:effectExtent l="0" t="0" r="0" b="7620"/>
+            <wp:docPr id="217739138" name="Obraz 2"/>
+            <wp:cNvGraphicFramePr>
+              <a:graphicFrameLocks xmlns:a="http://schemas.openxmlformats.org/drawingml/2006/main" noChangeAspect="1"/>
+            </wp:cNvGraphicFramePr>
+            <a:graphic xmlns:a="http://schemas.openxmlformats.org/drawingml/2006/main">
+              <a:graphicData uri="http://schemas.openxmlformats.org/drawingml/2006/picture">
+                <pic:pic xmlns:pic="http://schemas.openxmlformats.org/drawingml/2006/picture">
+                  <pic:nvPicPr>
+                    <pic:cNvPr id="0" name="Picture 2"/>
+                    <pic:cNvPicPr>
+                      <a:picLocks noChangeAspect="1" noChangeArrowheads="1"/>
+                    </pic:cNvPicPr>
+                  </pic:nvPicPr>
+                  <pic:blipFill>
+                    <a:blip r:embed="rId24" cstate="print">
+                      <a:extLst>
+                        <a:ext uri="{28A0092B-C50C-407E-A947-70E740481C1C}">
+                          <a14:useLocalDpi xmlns:a14="http://schemas.microsoft.com/office/drawing/2010/main" val="0"/>
+                        </a:ext>
+                      </a:extLst>
+                    </a:blip>
+                    <a:srcRect/>
+                    <a:stretch>
+                      <a:fillRect/>
+                    </a:stretch>
+                  </pic:blipFill>
+                  <pic:spPr bwMode="auto">
+                    <a:xfrm>
+                      <a:off x="0" y="0"/>
+                      <a:ext cx="5570855" cy="1859280"/>
+                    </a:xfrm>
+                    <a:prstGeom prst="rect">
+                      <a:avLst/>
+                    </a:prstGeom>
+                    <a:noFill/>
+                    <a:ln>
+                      <a:noFill/>
+                    </a:ln>
+                  </pic:spPr>
+                </pic:pic>
+              </a:graphicData>
+            </a:graphic>
+          </wp:inline>
+        </w:drawing>
+      </w:r>
+      <w:r>
+        <w:rPr>
+          <w:lang w:val="en-US"/>
+        </w:rPr>
         <w:br w:type="page"/>
       </w:r>
     </w:p>
@@ -17587,7 +17597,7 @@
         </w:rPr>
         <w:tab/>
       </w:r>
-      <w:hyperlink r:id="rId23" w:history="1">
+      <w:hyperlink r:id="rId25" w:history="1">
         <w:r>
           <w:rPr>
             <w:rStyle w:val="Hipercze"/>
@@ -17656,7 +17666,7 @@
         </w:rPr>
         <w:tab/>
       </w:r>
-      <w:hyperlink r:id="rId24" w:history="1">
+      <w:hyperlink r:id="rId26" w:history="1">
         <w:r>
           <w:rPr>
             <w:rStyle w:val="Hipercze"/>
@@ -18234,7 +18244,7 @@
         <w:tab/>
         <w:t xml:space="preserve">Mit Bih Arythmia Dataset </w:t>
       </w:r>
-      <w:hyperlink r:id="rId25" w:history="1">
+      <w:hyperlink r:id="rId27" w:history="1">
         <w:r>
           <w:rPr>
             <w:rStyle w:val="Hipercze"/>
@@ -18516,7 +18526,7 @@
         </w:rPr>
         <w:tab/>
       </w:r>
-      <w:hyperlink r:id="rId26" w:history="1">
+      <w:hyperlink r:id="rId28" w:history="1">
         <w:r>
           <w:rPr>
             <w:rStyle w:val="Hipercze"/>
@@ -18570,7 +18580,7 @@
         </w:rPr>
         <w:tab/>
       </w:r>
-      <w:hyperlink r:id="rId27" w:history="1">
+      <w:hyperlink r:id="rId29" w:history="1">
         <w:r>
           <w:rPr>
             <w:rStyle w:val="Hipercze"/>
@@ -18632,7 +18642,7 @@
         </w:rPr>
         <w:tab/>
       </w:r>
-      <w:hyperlink r:id="rId28" w:history="1">
+      <w:hyperlink r:id="rId30" w:history="1">
         <w:r>
           <w:rPr>
             <w:rStyle w:val="Hipercze"/>
@@ -22962,6 +22972,7 @@
   <w:style w:type="character" w:default="1" w:styleId="Domylnaczcionkaakapitu">
     <w:name w:val="Default Paragraph Font"/>
     <w:uiPriority w:val="1"/>
+    <w:semiHidden/>
     <w:unhideWhenUsed/>
   </w:style>
   <w:style w:type="table" w:default="1" w:styleId="Standardowy">
@@ -25153,12 +25164,7 @@
 </file>
 
 <file path=customXml/item2.xml><?xml version="1.0" encoding="utf-8"?>
-<?mso-contentType ?>
-<FormTemplates xmlns="http://schemas.microsoft.com/sharepoint/v3/contenttype/forms">
-  <Display>DocumentLibraryForm</Display>
-  <Edit>DocumentLibraryForm</Edit>
-  <New>DocumentLibraryForm</New>
-</FormTemplates>
+<b:Sources xmlns:b="http://schemas.openxmlformats.org/officeDocument/2006/bibliography" xmlns="http://schemas.openxmlformats.org/officeDocument/2006/bibliography" SelectedStyle="\APASixthEditionOfficeOnline.xsl" StyleName="APA" Version="6"/>
 </file>
 
 <file path=customXml/item3.xml><?xml version="1.0" encoding="utf-8"?>
@@ -25170,7 +25176,12 @@
 </file>
 
 <file path=customXml/item4.xml><?xml version="1.0" encoding="utf-8"?>
-<b:Sources xmlns:b="http://schemas.openxmlformats.org/officeDocument/2006/bibliography" xmlns="http://schemas.openxmlformats.org/officeDocument/2006/bibliography" SelectedStyle="\APASixthEditionOfficeOnline.xsl" StyleName="APA" Version="6"/>
+<?mso-contentType ?>
+<FormTemplates xmlns="http://schemas.microsoft.com/sharepoint/v3/contenttype/forms">
+  <Display>DocumentLibraryForm</Display>
+  <Edit>DocumentLibraryForm</Edit>
+  <New>DocumentLibraryForm</New>
+</FormTemplates>
 </file>
 
 <file path=customXml/itemProps1.xml><?xml version="1.0" encoding="utf-8"?>
@@ -25192,9 +25203,9 @@
 </file>
 
 <file path=customXml/itemProps2.xml><?xml version="1.0" encoding="utf-8"?>
-<ds:datastoreItem xmlns:ds="http://schemas.openxmlformats.org/officeDocument/2006/customXml" ds:itemID="{75D47452-D632-4C33-ACBD-A77D16E6A479}">
+<ds:datastoreItem xmlns:ds="http://schemas.openxmlformats.org/officeDocument/2006/customXml" ds:itemID="{10AEA2A0-C596-4161-82D6-D82504EDC790}">
   <ds:schemaRefs>
-    <ds:schemaRef ds:uri="http://schemas.microsoft.com/sharepoint/v3/contenttype/forms"/>
+    <ds:schemaRef ds:uri="http://schemas.openxmlformats.org/officeDocument/2006/bibliography"/>
   </ds:schemaRefs>
 </ds:datastoreItem>
 </file>
@@ -25210,9 +25221,9 @@
 </file>
 
 <file path=customXml/itemProps4.xml><?xml version="1.0" encoding="utf-8"?>
-<ds:datastoreItem xmlns:ds="http://schemas.openxmlformats.org/officeDocument/2006/customXml" ds:itemID="{10AEA2A0-C596-4161-82D6-D82504EDC790}">
+<ds:datastoreItem xmlns:ds="http://schemas.openxmlformats.org/officeDocument/2006/customXml" ds:itemID="{75D47452-D632-4C33-ACBD-A77D16E6A479}">
   <ds:schemaRefs>
-    <ds:schemaRef ds:uri="http://schemas.openxmlformats.org/officeDocument/2006/bibliography"/>
+    <ds:schemaRef ds:uri="http://schemas.microsoft.com/sharepoint/v3/contenttype/forms"/>
   </ds:schemaRefs>
 </ds:datastoreItem>
 </file>

</xml_diff>